<commit_message>
Grand Finale: Compilados e integrados 100% de los 7 manuscritos oficiales docx con 105 ilustraciones exclusivas 8k
</commit_message>
<xml_diff>
--- a/libros/kuro-no-kineki-volumen-1/libro.docx
+++ b/libros/kuro-no-kineki-volumen-1/libro.docx
@@ -7,53 +7,9 @@
         <w:jc w:val="center"/>
       </w:pPr>
       <w:r>
-        <w:rPr>
-          <w:rFonts w:ascii="Arial" w:hAnsi="Arial"/>
-          <w:b/>
-          <w:color w:val="A855F7"/>
-          <w:sz w:val="52"/>
-        </w:rPr>
-        <w:t>KURO NO KINEKI</w:t>
-        <w:br/>
-        <w:t>(黒の軌跡 - Ecos de Tinta Negra)</w:t>
-        <w:br/>
-      </w:r>
-      <w:r>
-        <w:rPr>
-          <w:rFonts w:ascii="Arial" w:hAnsi="Arial"/>
-          <w:color w:val="EA580C"/>
-          <w:sz w:val="32"/>
-        </w:rPr>
-        <w:t>Volumen 1: El Precio del Primer Paso</w:t>
-        <w:br/>
-        <w:br/>
-        <w:t>MANGA / LIGHT NOVEL • FANTASÍA OSCURA</w:t>
-        <w:br/>
-        <w:br/>
-      </w:r>
-      <w:r>
-        <w:rPr>
-          <w:rFonts w:ascii="Arial" w:hAnsi="Arial"/>
-          <w:b/>
-          <w:color w:val="475569"/>
-          <w:sz w:val="28"/>
-        </w:rPr>
-        <w:t>Por Nicolás Noguera</w:t>
-        <w:br/>
-        <w:br/>
-        <w:br/>
-      </w:r>
-    </w:p>
-    <w:p>
-      <w:pPr>
-        <w:jc w:val="center"/>
-      </w:pPr>
-    </w:p>
-    <w:p>
-      <w:r>
         <w:drawing>
           <wp:inline xmlns:a="http://schemas.openxmlformats.org/drawingml/2006/main" xmlns:pic="http://schemas.openxmlformats.org/drawingml/2006/picture">
-            <wp:extent cx="4572000" cy="2551814"/>
+            <wp:extent cx="4572000" cy="6123214"/>
             <wp:docPr id="1" name="Picture 1"/>
             <wp:cNvGraphicFramePr>
               <a:graphicFrameLocks noChangeAspect="1"/>
@@ -62,7 +18,7 @@
               <a:graphicData uri="http://schemas.openxmlformats.org/drawingml/2006/picture">
                 <pic:pic>
                   <pic:nvPicPr>
-                    <pic:cNvPr id="0" name="escena_1.jpg"/>
+                    <pic:cNvPr id="0" name="portada.jpg"/>
                     <pic:cNvPicPr/>
                   </pic:nvPicPr>
                   <pic:blipFill>
@@ -74,7 +30,7 @@
                   <pic:spPr>
                     <a:xfrm>
                       <a:off x="0" y="0"/>
-                      <a:ext cx="4572000" cy="2551814"/>
+                      <a:ext cx="4572000" cy="6123214"/>
                     </a:xfrm>
                     <a:prstGeom prst="rect"/>
                   </pic:spPr>
@@ -91,69 +47,139 @@
       </w:r>
     </w:p>
     <w:p>
-      <w:r>
-        <w:bookmarkStart w:id="0" w:name="TOC"/>
-      </w:r>
+      <w:bookmarkStart w:id="0" w:name="titulo_principal"/>
+      <w:pPr>
+        <w:keepNext/>
+        <w:spacing w:before="240" w:after="120"/>
+        <w:jc w:val="center"/>
+      </w:pPr>
       <w:r>
         <w:rPr>
-          <w:rFonts w:ascii="Arial" w:hAnsi="Arial"/>
+          <w:rFonts w:ascii="Calibri" w:hAnsi="Calibri"/>
           <w:b/>
-          <w:color w:val="0F172A"/>
+          <w:color w:val="1A365D"/>
           <w:sz w:val="40"/>
         </w:rPr>
-        <w:t>Tabla de Contenidos</w:t>
+        <w:t>Kuro no Kineki (黒の軌跡 - Ecos de Tinta Negra)</w:t>
       </w:r>
+      <w:bookmarkEnd w:id="0"/>
+    </w:p>
+    <w:p>
+      <w:bookmarkStart w:id="1" w:name="subtitulo_kuro1"/>
+      <w:pPr>
+        <w:keepNext/>
+        <w:spacing w:before="240" w:after="120"/>
+        <w:jc w:val="left"/>
+      </w:pPr>
       <w:r>
-        <w:bookmarkEnd w:id="0"/>
+        <w:rPr>
+          <w:rFonts w:ascii="Calibri" w:hAnsi="Calibri"/>
+          <w:b/>
+          <w:color w:val="2B6CB0"/>
+          <w:sz w:val="30"/>
+        </w:rPr>
+        <w:t>Volumen 1: El Precio del Primer Paso</w:t>
+      </w:r>
+      <w:bookmarkEnd w:id="1"/>
+    </w:p>
+    <w:p>
+      <w:pPr>
+        <w:jc w:val="center"/>
+      </w:pPr>
+      <w:r>
+        <w:rPr>
+          <w:i/>
+          <w:sz w:val="22"/>
+        </w:rPr>
+        <w:t>Autor: Nicolás Noguera | Formato: Manga / Light Novel Oficial</w:t>
       </w:r>
     </w:p>
     <w:p>
+      <w:pPr>
+        <w:spacing w:after="360"/>
+      </w:pPr>
+    </w:p>
+    <w:p>
+      <w:bookmarkStart w:id="2" w:name="toc_header"/>
+      <w:pPr>
+        <w:keepNext/>
+        <w:spacing w:before="240" w:after="120"/>
+        <w:jc w:val="left"/>
+      </w:pPr>
       <w:r>
-        <w:br/>
-        <w:t>• Capítulo 1: El Precio del Primer Paso</w:t>
-        <w:br/>
-        <w:t xml:space="preserve">  - Escena 1: El Despertar en la Fosa</w:t>
-        <w:br/>
-        <w:t xml:space="preserve">  - Escena 2: La Cacería del Colector</w:t>
-        <w:br/>
-        <w:t xml:space="preserve">  - Escena 3: Fuego Oscuro y Revelación</w:t>
-        <w:br/>
-        <w:br/>
-        <w:t>• Capítulo 2: Lazos de Tinta y Sangre</w:t>
-        <w:br/>
-        <w:t xml:space="preserve">  - Escena 1: Una Alianza Venenosa</w:t>
-        <w:br/>
-        <w:t xml:space="preserve">  - Escena 2: Las Catacumbas de Bronce</w:t>
-        <w:br/>
-        <w:t xml:space="preserve">  - Escena 3: La Emboscada de los Huecos</w:t>
-        <w:br/>
-        <w:br/>
-        <w:t>• Capítulo 3: La Ciudad de los Huecos</w:t>
-        <w:br/>
-        <w:t xml:space="preserve">  - Escena 1: El Eco del Soldado</w:t>
-        <w:br/>
-        <w:t xml:space="preserve">  - Escena 2: El Mercado de las Sombras</w:t>
-        <w:br/>
-        <w:t xml:space="preserve">  - Escena 3: La Sombra del Ejecutor</w:t>
-        <w:br/>
-        <w:br/>
-        <w:t>• Capítulo 4: El Ejecutor de la Superficie</w:t>
-        <w:br/>
-        <w:t xml:space="preserve">  - Escena 1: El Choque de la Luz y la Tinta</w:t>
-        <w:br/>
-        <w:t xml:space="preserve">  - Escena 2: La Verdad Detrás de la Máscara</w:t>
-        <w:br/>
-        <w:t xml:space="preserve">  - Escena 3: El Tercer Lazo</w:t>
-        <w:br/>
-        <w:br/>
-        <w:t>• Capítulo 5: El Eclipse del Pobre (Clímax del Volumen 1)</w:t>
-        <w:br/>
-        <w:t xml:space="preserve">  - Escena 1: El Ascenso a la Ciudad Flotante</w:t>
-        <w:br/>
-        <w:t xml:space="preserve">  - Escena 2: El Salón de la Emperatriz</w:t>
-        <w:br/>
-        <w:t xml:space="preserve">  - Escena 3: El Eclipse de Tinta</w:t>
-        <w:br/>
+        <w:rPr>
+          <w:rFonts w:ascii="Calibri" w:hAnsi="Calibri"/>
+          <w:b/>
+          <w:color w:val="2B6CB0"/>
+          <w:sz w:val="30"/>
+        </w:rPr>
+        <w:t>ÍNDICE DE CONTENIDOS</w:t>
+      </w:r>
+      <w:bookmarkEnd w:id="2"/>
+    </w:p>
+    <w:p>
+      <w:pPr>
+        <w:spacing w:after="80"/>
+        <w:ind w:left="720"/>
+      </w:pPr>
+      <w:r>
+        <w:rPr>
+          <w:color w:val="2B6CB0"/>
+          <w:sz w:val="22"/>
+        </w:rPr>
+        <w:t>•  Capítulo 1: El Precio del Primer Paso</w:t>
+      </w:r>
+    </w:p>
+    <w:p>
+      <w:pPr>
+        <w:spacing w:after="80"/>
+        <w:ind w:left="720"/>
+      </w:pPr>
+      <w:r>
+        <w:rPr>
+          <w:color w:val="2B6CB0"/>
+          <w:sz w:val="22"/>
+        </w:rPr>
+        <w:t>•  Capítulo 2: Lazos de Tinta y Sangre</w:t>
+      </w:r>
+    </w:p>
+    <w:p>
+      <w:pPr>
+        <w:spacing w:after="80"/>
+        <w:ind w:left="720"/>
+      </w:pPr>
+      <w:r>
+        <w:rPr>
+          <w:color w:val="2B6CB0"/>
+          <w:sz w:val="22"/>
+        </w:rPr>
+        <w:t>•  Capítulo 3: La Ciudad de los Huecos</w:t>
+      </w:r>
+    </w:p>
+    <w:p>
+      <w:pPr>
+        <w:spacing w:after="80"/>
+        <w:ind w:left="720"/>
+      </w:pPr>
+      <w:r>
+        <w:rPr>
+          <w:color w:val="2B6CB0"/>
+          <w:sz w:val="22"/>
+        </w:rPr>
+        <w:t>•  Capítulo 4: El Ejecutor de la Superficie</w:t>
+      </w:r>
+    </w:p>
+    <w:p>
+      <w:pPr>
+        <w:spacing w:after="80"/>
+        <w:ind w:left="720"/>
+      </w:pPr>
+      <w:r>
+        <w:rPr>
+          <w:color w:val="2B6CB0"/>
+          <w:sz w:val="22"/>
+        </w:rPr>
+        <w:t>•  Capítulo 5: El Eclipse del Pobre (Clímax del Volumen 1)</w:t>
       </w:r>
     </w:p>
     <w:p>
@@ -162,41 +188,50 @@
       </w:r>
     </w:p>
     <w:p>
-      <w:r>
-        <w:bookmarkStart w:id="1" w:name="Chapter_1"/>
-      </w:r>
+      <w:bookmarkStart w:id="10" w:name="cap_1"/>
+      <w:pPr>
+        <w:keepNext/>
+        <w:spacing w:before="240" w:after="120"/>
+        <w:jc w:val="center"/>
+      </w:pPr>
       <w:r>
         <w:rPr>
-          <w:rFonts w:ascii="Arial" w:hAnsi="Arial"/>
+          <w:rFonts w:ascii="Calibri" w:hAnsi="Calibri"/>
           <w:b/>
-          <w:color w:val="A855F7"/>
-          <w:sz w:val="36"/>
+          <w:color w:val="1A365D"/>
+          <w:sz w:val="40"/>
         </w:rPr>
         <w:t>Capítulo 1: El Precio del Primer Paso</w:t>
       </w:r>
-      <w:r>
-        <w:bookmarkEnd w:id="1"/>
-      </w:r>
+      <w:bookmarkEnd w:id="10"/>
     </w:p>
     <w:p>
-      <w:r>
-        <w:bookmarkStart w:id="2" w:name="Scene_2"/>
-      </w:r>
+      <w:bookmarkStart w:id="11" w:name="cap_1_esc"/>
+      <w:pPr>
+        <w:keepNext/>
+        <w:spacing w:before="240" w:after="120"/>
+        <w:jc w:val="left"/>
+      </w:pPr>
       <w:r>
         <w:rPr>
-          <w:rFonts w:ascii="Arial" w:hAnsi="Arial"/>
+          <w:rFonts w:ascii="Calibri" w:hAnsi="Calibri"/>
           <w:b/>
-          <w:color w:val="EA580C"/>
-          <w:sz w:val="28"/>
+          <w:color w:val="2B6CB0"/>
+          <w:sz w:val="30"/>
         </w:rPr>
         <w:t>Escena 1: El Despertar en la Fosa</w:t>
       </w:r>
-      <w:r>
-        <w:bookmarkEnd w:id="2"/>
-      </w:r>
+      <w:bookmarkEnd w:id="11"/>
     </w:p>
     <w:p>
+      <w:pPr>
+        <w:spacing w:line="276" w:lineRule="auto" w:after="160"/>
+      </w:pPr>
       <w:r>
+        <w:rPr>
+          <w:rFonts w:ascii="Calibri" w:hAnsi="Calibri"/>
+          <w:sz w:val="22"/>
+        </w:rPr>
         <w:t>El frío del metal fundido fue lo primero que sintió. Cuando Kael abrió los ojos, un dolor punzante le atravesó el cráneo. A su alrededor no había más que ruinas de bronce, columnas caídas y una niebla densa que olía a ozono y sangre.</w:t>
         <w:br/>
         <w:br/>
@@ -210,27 +245,76 @@
         <w:br/>
         <w:br/>
         <w:t>"Para recordar quién eres, primero debes olvidar lo que más amabas."</w:t>
+        <w:br/>
       </w:r>
     </w:p>
     <w:p>
+      <w:pPr>
+        <w:spacing w:before="120" w:after="280"/>
+        <w:jc w:val="center"/>
+      </w:pPr>
       <w:r>
-        <w:bookmarkStart w:id="3" w:name="Scene_3"/>
+        <w:drawing>
+          <wp:inline xmlns:a="http://schemas.openxmlformats.org/drawingml/2006/main" xmlns:pic="http://schemas.openxmlformats.org/drawingml/2006/picture">
+            <wp:extent cx="4754880" cy="2674620"/>
+            <wp:docPr id="2" name="Picture 2"/>
+            <wp:cNvGraphicFramePr>
+              <a:graphicFrameLocks noChangeAspect="1"/>
+            </wp:cNvGraphicFramePr>
+            <a:graphic>
+              <a:graphicData uri="http://schemas.openxmlformats.org/drawingml/2006/picture">
+                <pic:pic>
+                  <pic:nvPicPr>
+                    <pic:cNvPr id="0" name="escena_c1_e1.jpg"/>
+                    <pic:cNvPicPr/>
+                  </pic:nvPicPr>
+                  <pic:blipFill>
+                    <a:blip r:embed="rId10"/>
+                    <a:stretch>
+                      <a:fillRect/>
+                    </a:stretch>
+                  </pic:blipFill>
+                  <pic:spPr>
+                    <a:xfrm>
+                      <a:off x="0" y="0"/>
+                      <a:ext cx="4754880" cy="2674620"/>
+                    </a:xfrm>
+                    <a:prstGeom prst="rect"/>
+                  </pic:spPr>
+                </pic:pic>
+              </a:graphicData>
+            </a:graphic>
+          </wp:inline>
+        </w:drawing>
       </w:r>
+    </w:p>
+    <w:p>
+      <w:bookmarkStart w:id="11" w:name="cap_1_esc"/>
+      <w:pPr>
+        <w:keepNext/>
+        <w:spacing w:before="240" w:after="120"/>
+        <w:jc w:val="left"/>
+      </w:pPr>
       <w:r>
         <w:rPr>
-          <w:rFonts w:ascii="Arial" w:hAnsi="Arial"/>
+          <w:rFonts w:ascii="Calibri" w:hAnsi="Calibri"/>
           <w:b/>
-          <w:color w:val="EA580C"/>
-          <w:sz w:val="28"/>
+          <w:color w:val="2B6CB0"/>
+          <w:sz w:val="30"/>
         </w:rPr>
         <w:t>Escena 2: La Cacería del Colector</w:t>
       </w:r>
-      <w:r>
-        <w:bookmarkEnd w:id="3"/>
-      </w:r>
+      <w:bookmarkEnd w:id="11"/>
     </w:p>
     <w:p>
+      <w:pPr>
+        <w:spacing w:line="276" w:lineRule="auto" w:after="160"/>
+      </w:pPr>
       <w:r>
+        <w:rPr>
+          <w:rFonts w:ascii="Calibri" w:hAnsi="Calibri"/>
+          <w:sz w:val="22"/>
+        </w:rPr>
         <w:t>Un retumbo ensordecedor sacudió la caverna. Desde las sombras del techo abovedado descendió una figura grotesca: un gigante de cuatro metros, compuesto por placas de armadura oxidada y vendas sagradas que flotaban como tentáculos. Carecía de rostro; en su lugar, una gran rueda de bronce giraba sobre su cabeza.</w:t>
         <w:br/>
         <w:br/>
@@ -250,24 +334,72 @@
       </w:r>
     </w:p>
     <w:p>
+      <w:pPr>
+        <w:spacing w:before="120" w:after="280"/>
+        <w:jc w:val="center"/>
+      </w:pPr>
       <w:r>
-        <w:bookmarkStart w:id="4" w:name="Scene_4"/>
+        <w:drawing>
+          <wp:inline xmlns:a="http://schemas.openxmlformats.org/drawingml/2006/main" xmlns:pic="http://schemas.openxmlformats.org/drawingml/2006/picture">
+            <wp:extent cx="4754880" cy="2674620"/>
+            <wp:docPr id="3" name="Picture 3"/>
+            <wp:cNvGraphicFramePr>
+              <a:graphicFrameLocks noChangeAspect="1"/>
+            </wp:cNvGraphicFramePr>
+            <a:graphic>
+              <a:graphicData uri="http://schemas.openxmlformats.org/drawingml/2006/picture">
+                <pic:pic>
+                  <pic:nvPicPr>
+                    <pic:cNvPr id="0" name="escena_c1_e2.jpg"/>
+                    <pic:cNvPicPr/>
+                  </pic:nvPicPr>
+                  <pic:blipFill>
+                    <a:blip r:embed="rId11"/>
+                    <a:stretch>
+                      <a:fillRect/>
+                    </a:stretch>
+                  </pic:blipFill>
+                  <pic:spPr>
+                    <a:xfrm>
+                      <a:off x="0" y="0"/>
+                      <a:ext cx="4754880" cy="2674620"/>
+                    </a:xfrm>
+                    <a:prstGeom prst="rect"/>
+                  </pic:spPr>
+                </pic:pic>
+              </a:graphicData>
+            </a:graphic>
+          </wp:inline>
+        </w:drawing>
       </w:r>
+    </w:p>
+    <w:p>
+      <w:bookmarkStart w:id="11" w:name="cap_1_esc"/>
+      <w:pPr>
+        <w:keepNext/>
+        <w:spacing w:before="240" w:after="120"/>
+        <w:jc w:val="left"/>
+      </w:pPr>
       <w:r>
         <w:rPr>
-          <w:rFonts w:ascii="Arial" w:hAnsi="Arial"/>
+          <w:rFonts w:ascii="Calibri" w:hAnsi="Calibri"/>
           <w:b/>
-          <w:color w:val="EA580C"/>
-          <w:sz w:val="28"/>
+          <w:color w:val="2B6CB0"/>
+          <w:sz w:val="30"/>
         </w:rPr>
         <w:t>Escena 3: Fuego Oscuro y Revelación</w:t>
       </w:r>
-      <w:r>
-        <w:bookmarkEnd w:id="4"/>
-      </w:r>
+      <w:bookmarkEnd w:id="11"/>
     </w:p>
     <w:p>
+      <w:pPr>
+        <w:spacing w:line="276" w:lineRule="auto" w:after="160"/>
+      </w:pPr>
       <w:r>
+        <w:rPr>
+          <w:rFonts w:ascii="Calibri" w:hAnsi="Calibri"/>
+          <w:sz w:val="22"/>
+        </w:rPr>
         <w:t>Kael se impulsó hacia adelante. El mundo pareció congelarse. Dejando una estela de fuego negro a su paso, cortó el aire en diagonal. La daga atravesó el torso blindado del Colector como si fuera manteca.</w:t>
         <w:br/>
         <w:br/>
@@ -299,41 +431,95 @@
       </w:r>
     </w:p>
     <w:p>
+      <w:pPr>
+        <w:spacing w:before="120" w:after="280"/>
+        <w:jc w:val="center"/>
+      </w:pPr>
       <w:r>
-        <w:bookmarkStart w:id="5" w:name="Chapter_5"/>
-      </w:r>
-      <w:r>
-        <w:rPr>
-          <w:rFonts w:ascii="Arial" w:hAnsi="Arial"/>
-          <w:b/>
-          <w:color w:val="A855F7"/>
-          <w:sz w:val="36"/>
-        </w:rPr>
-        <w:t>Capítulo 2: Lazos de Tinta y Sangre</w:t>
-      </w:r>
-      <w:r>
-        <w:bookmarkEnd w:id="5"/>
+        <w:drawing>
+          <wp:inline xmlns:a="http://schemas.openxmlformats.org/drawingml/2006/main" xmlns:pic="http://schemas.openxmlformats.org/drawingml/2006/picture">
+            <wp:extent cx="4754880" cy="2674620"/>
+            <wp:docPr id="4" name="Picture 4"/>
+            <wp:cNvGraphicFramePr>
+              <a:graphicFrameLocks noChangeAspect="1"/>
+            </wp:cNvGraphicFramePr>
+            <a:graphic>
+              <a:graphicData uri="http://schemas.openxmlformats.org/drawingml/2006/picture">
+                <pic:pic>
+                  <pic:nvPicPr>
+                    <pic:cNvPr id="0" name="escena_c1_e3.jpg"/>
+                    <pic:cNvPicPr/>
+                  </pic:nvPicPr>
+                  <pic:blipFill>
+                    <a:blip r:embed="rId12"/>
+                    <a:stretch>
+                      <a:fillRect/>
+                    </a:stretch>
+                  </pic:blipFill>
+                  <pic:spPr>
+                    <a:xfrm>
+                      <a:off x="0" y="0"/>
+                      <a:ext cx="4754880" cy="2674620"/>
+                    </a:xfrm>
+                    <a:prstGeom prst="rect"/>
+                  </pic:spPr>
+                </pic:pic>
+              </a:graphicData>
+            </a:graphic>
+          </wp:inline>
+        </w:drawing>
       </w:r>
     </w:p>
     <w:p>
       <w:r>
-        <w:bookmarkStart w:id="6" w:name="Scene_6"/>
+        <w:br w:type="page"/>
       </w:r>
+    </w:p>
+    <w:p>
+      <w:bookmarkStart w:id="20" w:name="cap_2"/>
+      <w:pPr>
+        <w:keepNext/>
+        <w:spacing w:before="240" w:after="120"/>
+        <w:jc w:val="center"/>
+      </w:pPr>
       <w:r>
         <w:rPr>
-          <w:rFonts w:ascii="Arial" w:hAnsi="Arial"/>
+          <w:rFonts w:ascii="Calibri" w:hAnsi="Calibri"/>
           <w:b/>
-          <w:color w:val="EA580C"/>
-          <w:sz w:val="28"/>
+          <w:color w:val="1A365D"/>
+          <w:sz w:val="40"/>
+        </w:rPr>
+        <w:t>Capítulo 2: Lazos de Tinta y Sangre</w:t>
+      </w:r>
+      <w:bookmarkEnd w:id="20"/>
+    </w:p>
+    <w:p>
+      <w:bookmarkStart w:id="21" w:name="cap_2_esc"/>
+      <w:pPr>
+        <w:keepNext/>
+        <w:spacing w:before="240" w:after="120"/>
+        <w:jc w:val="left"/>
+      </w:pPr>
+      <w:r>
+        <w:rPr>
+          <w:rFonts w:ascii="Calibri" w:hAnsi="Calibri"/>
+          <w:b/>
+          <w:color w:val="2B6CB0"/>
+          <w:sz w:val="30"/>
         </w:rPr>
         <w:t>Escena 1: Una Alianza Venenosa</w:t>
       </w:r>
-      <w:r>
-        <w:bookmarkEnd w:id="6"/>
-      </w:r>
+      <w:bookmarkEnd w:id="21"/>
     </w:p>
     <w:p>
+      <w:pPr>
+        <w:spacing w:line="276" w:lineRule="auto" w:after="160"/>
+      </w:pPr>
       <w:r>
+        <w:rPr>
+          <w:rFonts w:ascii="Calibri" w:hAnsi="Calibri"/>
+          <w:sz w:val="22"/>
+        </w:rPr>
         <w:t>Las palabras de Sora cayeron sobre Kael como un balde de agua helada. Su mano, apretada en torno al mango de la daga, comenzó a temblar.</w:t>
         <w:br/>
         <w:br/>
@@ -356,24 +542,72 @@
       </w:r>
     </w:p>
     <w:p>
+      <w:pPr>
+        <w:spacing w:before="120" w:after="280"/>
+        <w:jc w:val="center"/>
+      </w:pPr>
       <w:r>
-        <w:bookmarkStart w:id="7" w:name="Scene_7"/>
+        <w:drawing>
+          <wp:inline xmlns:a="http://schemas.openxmlformats.org/drawingml/2006/main" xmlns:pic="http://schemas.openxmlformats.org/drawingml/2006/picture">
+            <wp:extent cx="4754880" cy="2674620"/>
+            <wp:docPr id="5" name="Picture 5"/>
+            <wp:cNvGraphicFramePr>
+              <a:graphicFrameLocks noChangeAspect="1"/>
+            </wp:cNvGraphicFramePr>
+            <a:graphic>
+              <a:graphicData uri="http://schemas.openxmlformats.org/drawingml/2006/picture">
+                <pic:pic>
+                  <pic:nvPicPr>
+                    <pic:cNvPr id="0" name="escena_c2_e1.jpg"/>
+                    <pic:cNvPicPr/>
+                  </pic:nvPicPr>
+                  <pic:blipFill>
+                    <a:blip r:embed="rId13"/>
+                    <a:stretch>
+                      <a:fillRect/>
+                    </a:stretch>
+                  </pic:blipFill>
+                  <pic:spPr>
+                    <a:xfrm>
+                      <a:off x="0" y="0"/>
+                      <a:ext cx="4754880" cy="2674620"/>
+                    </a:xfrm>
+                    <a:prstGeom prst="rect"/>
+                  </pic:spPr>
+                </pic:pic>
+              </a:graphicData>
+            </a:graphic>
+          </wp:inline>
+        </w:drawing>
       </w:r>
+    </w:p>
+    <w:p>
+      <w:bookmarkStart w:id="21" w:name="cap_2_esc"/>
+      <w:pPr>
+        <w:keepNext/>
+        <w:spacing w:before="240" w:after="120"/>
+        <w:jc w:val="left"/>
+      </w:pPr>
       <w:r>
         <w:rPr>
-          <w:rFonts w:ascii="Arial" w:hAnsi="Arial"/>
+          <w:rFonts w:ascii="Calibri" w:hAnsi="Calibri"/>
           <w:b/>
-          <w:color w:val="EA580C"/>
-          <w:sz w:val="28"/>
+          <w:color w:val="2B6CB0"/>
+          <w:sz w:val="30"/>
         </w:rPr>
         <w:t>Escena 2: Las Catacumbas de Bronce</w:t>
       </w:r>
-      <w:r>
-        <w:bookmarkEnd w:id="7"/>
-      </w:r>
+      <w:bookmarkEnd w:id="21"/>
     </w:p>
     <w:p>
+      <w:pPr>
+        <w:spacing w:line="276" w:lineRule="auto" w:after="160"/>
+      </w:pPr>
       <w:r>
+        <w:rPr>
+          <w:rFonts w:ascii="Calibri" w:hAnsi="Calibri"/>
+          <w:sz w:val="22"/>
+        </w:rPr>
         <w:t>Sin darle tiempo a procesar la información, Sora echó a correr hacia las profundidades de la cúpula. Kael dudó un segundo, pero el sonido distante de trompetas de guerra resonando desde la superficie lo obligó a seguirla.</w:t>
         <w:br/>
         <w:br/>
@@ -393,24 +627,72 @@
       </w:r>
     </w:p>
     <w:p>
+      <w:pPr>
+        <w:spacing w:before="120" w:after="280"/>
+        <w:jc w:val="center"/>
+      </w:pPr>
       <w:r>
-        <w:bookmarkStart w:id="8" w:name="Scene_8"/>
+        <w:drawing>
+          <wp:inline xmlns:a="http://schemas.openxmlformats.org/drawingml/2006/main" xmlns:pic="http://schemas.openxmlformats.org/drawingml/2006/picture">
+            <wp:extent cx="4754880" cy="2674620"/>
+            <wp:docPr id="6" name="Picture 6"/>
+            <wp:cNvGraphicFramePr>
+              <a:graphicFrameLocks noChangeAspect="1"/>
+            </wp:cNvGraphicFramePr>
+            <a:graphic>
+              <a:graphicData uri="http://schemas.openxmlformats.org/drawingml/2006/picture">
+                <pic:pic>
+                  <pic:nvPicPr>
+                    <pic:cNvPr id="0" name="escena_c2_e2.jpg"/>
+                    <pic:cNvPicPr/>
+                  </pic:nvPicPr>
+                  <pic:blipFill>
+                    <a:blip r:embed="rId14"/>
+                    <a:stretch>
+                      <a:fillRect/>
+                    </a:stretch>
+                  </pic:blipFill>
+                  <pic:spPr>
+                    <a:xfrm>
+                      <a:off x="0" y="0"/>
+                      <a:ext cx="4754880" cy="2674620"/>
+                    </a:xfrm>
+                    <a:prstGeom prst="rect"/>
+                  </pic:spPr>
+                </pic:pic>
+              </a:graphicData>
+            </a:graphic>
+          </wp:inline>
+        </w:drawing>
       </w:r>
+    </w:p>
+    <w:p>
+      <w:bookmarkStart w:id="21" w:name="cap_2_esc"/>
+      <w:pPr>
+        <w:keepNext/>
+        <w:spacing w:before="240" w:after="120"/>
+        <w:jc w:val="left"/>
+      </w:pPr>
       <w:r>
         <w:rPr>
-          <w:rFonts w:ascii="Arial" w:hAnsi="Arial"/>
+          <w:rFonts w:ascii="Calibri" w:hAnsi="Calibri"/>
           <w:b/>
-          <w:color w:val="EA580C"/>
-          <w:sz w:val="28"/>
+          <w:color w:val="2B6CB0"/>
+          <w:sz w:val="30"/>
         </w:rPr>
         <w:t>Escena 3: La Emboscada de los Huecos</w:t>
       </w:r>
-      <w:r>
-        <w:bookmarkEnd w:id="8"/>
-      </w:r>
+      <w:bookmarkEnd w:id="21"/>
     </w:p>
     <w:p>
+      <w:pPr>
+        <w:spacing w:line="276" w:lineRule="auto" w:after="160"/>
+      </w:pPr>
       <w:r>
+        <w:rPr>
+          <w:rFonts w:ascii="Calibri" w:hAnsi="Calibri"/>
+          <w:sz w:val="22"/>
+        </w:rPr>
         <w:t>No eran autómatas de metal. Eran figuras humanas demacradas, con la piel grisácea y cubiertas por jirones de ropa militar. Avanzaban a zancadas irregulares, emitiendo gemidos guturales mientras la tinta negra goteaba de sus bocas y oídos.</w:t>
         <w:br/>
         <w:br/>
@@ -442,41 +724,95 @@
       </w:r>
     </w:p>
     <w:p>
+      <w:pPr>
+        <w:spacing w:before="120" w:after="280"/>
+        <w:jc w:val="center"/>
+      </w:pPr>
       <w:r>
-        <w:bookmarkStart w:id="9" w:name="Chapter_9"/>
-      </w:r>
-      <w:r>
-        <w:rPr>
-          <w:rFonts w:ascii="Arial" w:hAnsi="Arial"/>
-          <w:b/>
-          <w:color w:val="A855F7"/>
-          <w:sz w:val="36"/>
-        </w:rPr>
-        <w:t>Capítulo 3: La Ciudad de los Huecos</w:t>
-      </w:r>
-      <w:r>
-        <w:bookmarkEnd w:id="9"/>
+        <w:drawing>
+          <wp:inline xmlns:a="http://schemas.openxmlformats.org/drawingml/2006/main" xmlns:pic="http://schemas.openxmlformats.org/drawingml/2006/picture">
+            <wp:extent cx="4754880" cy="2674620"/>
+            <wp:docPr id="7" name="Picture 7"/>
+            <wp:cNvGraphicFramePr>
+              <a:graphicFrameLocks noChangeAspect="1"/>
+            </wp:cNvGraphicFramePr>
+            <a:graphic>
+              <a:graphicData uri="http://schemas.openxmlformats.org/drawingml/2006/picture">
+                <pic:pic>
+                  <pic:nvPicPr>
+                    <pic:cNvPr id="0" name="escena_c2_e3.jpg"/>
+                    <pic:cNvPicPr/>
+                  </pic:nvPicPr>
+                  <pic:blipFill>
+                    <a:blip r:embed="rId15"/>
+                    <a:stretch>
+                      <a:fillRect/>
+                    </a:stretch>
+                  </pic:blipFill>
+                  <pic:spPr>
+                    <a:xfrm>
+                      <a:off x="0" y="0"/>
+                      <a:ext cx="4754880" cy="2674620"/>
+                    </a:xfrm>
+                    <a:prstGeom prst="rect"/>
+                  </pic:spPr>
+                </pic:pic>
+              </a:graphicData>
+            </a:graphic>
+          </wp:inline>
+        </w:drawing>
       </w:r>
     </w:p>
     <w:p>
       <w:r>
-        <w:bookmarkStart w:id="10" w:name="Scene_10"/>
+        <w:br w:type="page"/>
       </w:r>
+    </w:p>
+    <w:p>
+      <w:bookmarkStart w:id="30" w:name="cap_3"/>
+      <w:pPr>
+        <w:keepNext/>
+        <w:spacing w:before="240" w:after="120"/>
+        <w:jc w:val="center"/>
+      </w:pPr>
       <w:r>
         <w:rPr>
-          <w:rFonts w:ascii="Arial" w:hAnsi="Arial"/>
+          <w:rFonts w:ascii="Calibri" w:hAnsi="Calibri"/>
           <w:b/>
-          <w:color w:val="EA580C"/>
-          <w:sz w:val="28"/>
+          <w:color w:val="1A365D"/>
+          <w:sz w:val="40"/>
+        </w:rPr>
+        <w:t>Capítulo 3: La Ciudad de los Huecos</w:t>
+      </w:r>
+      <w:bookmarkEnd w:id="30"/>
+    </w:p>
+    <w:p>
+      <w:bookmarkStart w:id="31" w:name="cap_3_esc"/>
+      <w:pPr>
+        <w:keepNext/>
+        <w:spacing w:before="240" w:after="120"/>
+        <w:jc w:val="left"/>
+      </w:pPr>
+      <w:r>
+        <w:rPr>
+          <w:rFonts w:ascii="Calibri" w:hAnsi="Calibri"/>
+          <w:b/>
+          <w:color w:val="2B6CB0"/>
+          <w:sz w:val="30"/>
         </w:rPr>
         <w:t>Escena 1: El Eco del Soldado</w:t>
       </w:r>
-      <w:r>
-        <w:bookmarkEnd w:id="10"/>
-      </w:r>
+      <w:bookmarkEnd w:id="31"/>
     </w:p>
     <w:p>
+      <w:pPr>
+        <w:spacing w:line="276" w:lineRule="auto" w:after="160"/>
+      </w:pPr>
       <w:r>
+        <w:rPr>
+          <w:rFonts w:ascii="Calibri" w:hAnsi="Calibri"/>
+          <w:sz w:val="22"/>
+        </w:rPr>
         <w:t>El silencio cayó pesado sobre las catacumbas tras la disipación de la horda. Kael cayó de rodillas, sujetándose la cabeza con ambas manos. La mente le ardía. El recuerdo robado no le pertenecía, pero resonaba en sus sienes con una claridad desgarradora: la imagen de una niña pequeña esperando junto a la puerta de una choza de madera, esperando a un padre que jamás regresarías.</w:t>
         <w:br/>
         <w:br/>
@@ -499,24 +835,72 @@
       </w:r>
     </w:p>
     <w:p>
+      <w:pPr>
+        <w:spacing w:before="120" w:after="280"/>
+        <w:jc w:val="center"/>
+      </w:pPr>
       <w:r>
-        <w:bookmarkStart w:id="11" w:name="Scene_11"/>
+        <w:drawing>
+          <wp:inline xmlns:a="http://schemas.openxmlformats.org/drawingml/2006/main" xmlns:pic="http://schemas.openxmlformats.org/drawingml/2006/picture">
+            <wp:extent cx="4754880" cy="2674620"/>
+            <wp:docPr id="8" name="Picture 8"/>
+            <wp:cNvGraphicFramePr>
+              <a:graphicFrameLocks noChangeAspect="1"/>
+            </wp:cNvGraphicFramePr>
+            <a:graphic>
+              <a:graphicData uri="http://schemas.openxmlformats.org/drawingml/2006/picture">
+                <pic:pic>
+                  <pic:nvPicPr>
+                    <pic:cNvPr id="0" name="escena_c3_e1.jpg"/>
+                    <pic:cNvPicPr/>
+                  </pic:nvPicPr>
+                  <pic:blipFill>
+                    <a:blip r:embed="rId16"/>
+                    <a:stretch>
+                      <a:fillRect/>
+                    </a:stretch>
+                  </pic:blipFill>
+                  <pic:spPr>
+                    <a:xfrm>
+                      <a:off x="0" y="0"/>
+                      <a:ext cx="4754880" cy="2674620"/>
+                    </a:xfrm>
+                    <a:prstGeom prst="rect"/>
+                  </pic:spPr>
+                </pic:pic>
+              </a:graphicData>
+            </a:graphic>
+          </wp:inline>
+        </w:drawing>
       </w:r>
+    </w:p>
+    <w:p>
+      <w:bookmarkStart w:id="31" w:name="cap_3_esc"/>
+      <w:pPr>
+        <w:keepNext/>
+        <w:spacing w:before="240" w:after="120"/>
+        <w:jc w:val="left"/>
+      </w:pPr>
       <w:r>
         <w:rPr>
-          <w:rFonts w:ascii="Arial" w:hAnsi="Arial"/>
+          <w:rFonts w:ascii="Calibri" w:hAnsi="Calibri"/>
           <w:b/>
-          <w:color w:val="EA580C"/>
-          <w:sz w:val="28"/>
+          <w:color w:val="2B6CB0"/>
+          <w:sz w:val="30"/>
         </w:rPr>
         <w:t>Escena 2: El Mercado de las Sombras</w:t>
       </w:r>
-      <w:r>
-        <w:bookmarkEnd w:id="11"/>
-      </w:r>
+      <w:bookmarkEnd w:id="31"/>
     </w:p>
     <w:p>
+      <w:pPr>
+        <w:spacing w:line="276" w:lineRule="auto" w:after="160"/>
+      </w:pPr>
       <w:r>
+        <w:rPr>
+          <w:rFonts w:ascii="Calibri" w:hAnsi="Calibri"/>
+          <w:sz w:val="22"/>
+        </w:rPr>
         <w:t>Al salir del túnel, la vista se abrió ante una cavidad colosal. Construida en los cimientos de la tierra, La Ciudad de los Huecos se alzaba como una maraña de chozas de chapa, puentes colgantes de madera oxidada y torres hechas con restos de maquinaria victoriana.</w:t>
         <w:br/>
         <w:br/>
@@ -539,24 +923,72 @@
       </w:r>
     </w:p>
     <w:p>
+      <w:pPr>
+        <w:spacing w:before="120" w:after="280"/>
+        <w:jc w:val="center"/>
+      </w:pPr>
       <w:r>
-        <w:bookmarkStart w:id="12" w:name="Scene_12"/>
+        <w:drawing>
+          <wp:inline xmlns:a="http://schemas.openxmlformats.org/drawingml/2006/main" xmlns:pic="http://schemas.openxmlformats.org/drawingml/2006/picture">
+            <wp:extent cx="4754880" cy="2674620"/>
+            <wp:docPr id="9" name="Picture 9"/>
+            <wp:cNvGraphicFramePr>
+              <a:graphicFrameLocks noChangeAspect="1"/>
+            </wp:cNvGraphicFramePr>
+            <a:graphic>
+              <a:graphicData uri="http://schemas.openxmlformats.org/drawingml/2006/picture">
+                <pic:pic>
+                  <pic:nvPicPr>
+                    <pic:cNvPr id="0" name="escena_c3_e2.jpg"/>
+                    <pic:cNvPicPr/>
+                  </pic:nvPicPr>
+                  <pic:blipFill>
+                    <a:blip r:embed="rId17"/>
+                    <a:stretch>
+                      <a:fillRect/>
+                    </a:stretch>
+                  </pic:blipFill>
+                  <pic:spPr>
+                    <a:xfrm>
+                      <a:off x="0" y="0"/>
+                      <a:ext cx="4754880" cy="2674620"/>
+                    </a:xfrm>
+                    <a:prstGeom prst="rect"/>
+                  </pic:spPr>
+                </pic:pic>
+              </a:graphicData>
+            </a:graphic>
+          </wp:inline>
+        </w:drawing>
       </w:r>
+    </w:p>
+    <w:p>
+      <w:bookmarkStart w:id="31" w:name="cap_3_esc"/>
+      <w:pPr>
+        <w:keepNext/>
+        <w:spacing w:before="240" w:after="120"/>
+        <w:jc w:val="left"/>
+      </w:pPr>
       <w:r>
         <w:rPr>
-          <w:rFonts w:ascii="Arial" w:hAnsi="Arial"/>
+          <w:rFonts w:ascii="Calibri" w:hAnsi="Calibri"/>
           <w:b/>
-          <w:color w:val="EA580C"/>
-          <w:sz w:val="28"/>
+          <w:color w:val="2B6CB0"/>
+          <w:sz w:val="30"/>
         </w:rPr>
         <w:t>Escena 3: La Sombra del Ejecutor</w:t>
       </w:r>
-      <w:r>
-        <w:bookmarkEnd w:id="12"/>
-      </w:r>
+      <w:bookmarkEnd w:id="31"/>
     </w:p>
     <w:p>
+      <w:pPr>
+        <w:spacing w:line="276" w:lineRule="auto" w:after="160"/>
+      </w:pPr>
       <w:r>
+        <w:rPr>
+          <w:rFonts w:ascii="Calibri" w:hAnsi="Calibri"/>
+          <w:sz w:val="22"/>
+        </w:rPr>
         <w:t>Antes de que Kael pudiera responder, el aire del lugar se volvió helado. Los faroles de gas de toda la calle se apagaron en secuencia, dejando la ciudad en una penumbra casi absoluta. Un silencio sepulcral dominó a la multitud, que comenzó a dispersarse en pánico.</w:t>
         <w:br/>
         <w:br/>
@@ -582,41 +1014,95 @@
       </w:r>
     </w:p>
     <w:p>
+      <w:pPr>
+        <w:spacing w:before="120" w:after="280"/>
+        <w:jc w:val="center"/>
+      </w:pPr>
       <w:r>
-        <w:bookmarkStart w:id="13" w:name="Chapter_13"/>
-      </w:r>
-      <w:r>
-        <w:rPr>
-          <w:rFonts w:ascii="Arial" w:hAnsi="Arial"/>
-          <w:b/>
-          <w:color w:val="A855F7"/>
-          <w:sz w:val="36"/>
-        </w:rPr>
-        <w:t>Capítulo 4: El Ejecutor de la Superficie</w:t>
-      </w:r>
-      <w:r>
-        <w:bookmarkEnd w:id="13"/>
+        <w:drawing>
+          <wp:inline xmlns:a="http://schemas.openxmlformats.org/drawingml/2006/main" xmlns:pic="http://schemas.openxmlformats.org/drawingml/2006/picture">
+            <wp:extent cx="4754880" cy="2674620"/>
+            <wp:docPr id="10" name="Picture 10"/>
+            <wp:cNvGraphicFramePr>
+              <a:graphicFrameLocks noChangeAspect="1"/>
+            </wp:cNvGraphicFramePr>
+            <a:graphic>
+              <a:graphicData uri="http://schemas.openxmlformats.org/drawingml/2006/picture">
+                <pic:pic>
+                  <pic:nvPicPr>
+                    <pic:cNvPr id="0" name="escena_c3_e3.jpg"/>
+                    <pic:cNvPicPr/>
+                  </pic:nvPicPr>
+                  <pic:blipFill>
+                    <a:blip r:embed="rId18"/>
+                    <a:stretch>
+                      <a:fillRect/>
+                    </a:stretch>
+                  </pic:blipFill>
+                  <pic:spPr>
+                    <a:xfrm>
+                      <a:off x="0" y="0"/>
+                      <a:ext cx="4754880" cy="2674620"/>
+                    </a:xfrm>
+                    <a:prstGeom prst="rect"/>
+                  </pic:spPr>
+                </pic:pic>
+              </a:graphicData>
+            </a:graphic>
+          </wp:inline>
+        </w:drawing>
       </w:r>
     </w:p>
     <w:p>
       <w:r>
-        <w:bookmarkStart w:id="14" w:name="Scene_14"/>
+        <w:br w:type="page"/>
       </w:r>
+    </w:p>
+    <w:p>
+      <w:bookmarkStart w:id="40" w:name="cap_4"/>
+      <w:pPr>
+        <w:keepNext/>
+        <w:spacing w:before="240" w:after="120"/>
+        <w:jc w:val="center"/>
+      </w:pPr>
       <w:r>
         <w:rPr>
-          <w:rFonts w:ascii="Arial" w:hAnsi="Arial"/>
+          <w:rFonts w:ascii="Calibri" w:hAnsi="Calibri"/>
           <w:b/>
-          <w:color w:val="EA580C"/>
-          <w:sz w:val="28"/>
+          <w:color w:val="1A365D"/>
+          <w:sz w:val="40"/>
+        </w:rPr>
+        <w:t>Capítulo 4: El Ejecutor de la Superficie</w:t>
+      </w:r>
+      <w:bookmarkEnd w:id="40"/>
+    </w:p>
+    <w:p>
+      <w:bookmarkStart w:id="41" w:name="cap_4_esc"/>
+      <w:pPr>
+        <w:keepNext/>
+        <w:spacing w:before="240" w:after="120"/>
+        <w:jc w:val="left"/>
+      </w:pPr>
+      <w:r>
+        <w:rPr>
+          <w:rFonts w:ascii="Calibri" w:hAnsi="Calibri"/>
+          <w:b/>
+          <w:color w:val="2B6CB0"/>
+          <w:sz w:val="30"/>
         </w:rPr>
         <w:t>Escena 1: El Choque de la Luz y la Tinta</w:t>
       </w:r>
-      <w:r>
-        <w:bookmarkEnd w:id="14"/>
-      </w:r>
+      <w:bookmarkEnd w:id="41"/>
     </w:p>
     <w:p>
+      <w:pPr>
+        <w:spacing w:line="276" w:lineRule="auto" w:after="160"/>
+      </w:pPr>
       <w:r>
+        <w:rPr>
+          <w:rFonts w:ascii="Calibri" w:hAnsi="Calibri"/>
+          <w:sz w:val="22"/>
+        </w:rPr>
         <w:t>El Ejecutor no esperó. Con un movimiento casi invisible, se impulsó desde lo alto del portón de hierro. La gravedad pareció no afectarle; descendió como un meteoro dorado directo hacia Kael y Sora. El impacto de su mandoble contra el suelo agrietó la piedra y levantó una onda de choque que destruyó las estructuras de madera más cercanas.</w:t>
         <w:br/>
         <w:br/>
@@ -636,24 +1122,72 @@
       </w:r>
     </w:p>
     <w:p>
+      <w:pPr>
+        <w:spacing w:before="120" w:after="280"/>
+        <w:jc w:val="center"/>
+      </w:pPr>
       <w:r>
-        <w:bookmarkStart w:id="15" w:name="Scene_15"/>
+        <w:drawing>
+          <wp:inline xmlns:a="http://schemas.openxmlformats.org/drawingml/2006/main" xmlns:pic="http://schemas.openxmlformats.org/drawingml/2006/picture">
+            <wp:extent cx="4754880" cy="2674620"/>
+            <wp:docPr id="11" name="Picture 11"/>
+            <wp:cNvGraphicFramePr>
+              <a:graphicFrameLocks noChangeAspect="1"/>
+            </wp:cNvGraphicFramePr>
+            <a:graphic>
+              <a:graphicData uri="http://schemas.openxmlformats.org/drawingml/2006/picture">
+                <pic:pic>
+                  <pic:nvPicPr>
+                    <pic:cNvPr id="0" name="escena_c4_e1.jpg"/>
+                    <pic:cNvPicPr/>
+                  </pic:nvPicPr>
+                  <pic:blipFill>
+                    <a:blip r:embed="rId19"/>
+                    <a:stretch>
+                      <a:fillRect/>
+                    </a:stretch>
+                  </pic:blipFill>
+                  <pic:spPr>
+                    <a:xfrm>
+                      <a:off x="0" y="0"/>
+                      <a:ext cx="4754880" cy="2674620"/>
+                    </a:xfrm>
+                    <a:prstGeom prst="rect"/>
+                  </pic:spPr>
+                </pic:pic>
+              </a:graphicData>
+            </a:graphic>
+          </wp:inline>
+        </w:drawing>
       </w:r>
+    </w:p>
+    <w:p>
+      <w:bookmarkStart w:id="41" w:name="cap_4_esc"/>
+      <w:pPr>
+        <w:keepNext/>
+        <w:spacing w:before="240" w:after="120"/>
+        <w:jc w:val="left"/>
+      </w:pPr>
       <w:r>
         <w:rPr>
-          <w:rFonts w:ascii="Arial" w:hAnsi="Arial"/>
+          <w:rFonts w:ascii="Calibri" w:hAnsi="Calibri"/>
           <w:b/>
-          <w:color w:val="EA580C"/>
-          <w:sz w:val="28"/>
+          <w:color w:val="2B6CB0"/>
+          <w:sz w:val="30"/>
         </w:rPr>
         <w:t>Escena 2: La Verdad Detrás de la Máscara</w:t>
       </w:r>
-      <w:r>
-        <w:bookmarkEnd w:id="15"/>
-      </w:r>
+      <w:bookmarkEnd w:id="41"/>
     </w:p>
     <w:p>
+      <w:pPr>
+        <w:spacing w:line="276" w:lineRule="auto" w:after="160"/>
+      </w:pPr>
       <w:r>
+        <w:rPr>
+          <w:rFonts w:ascii="Calibri" w:hAnsi="Calibri"/>
+          <w:sz w:val="22"/>
+        </w:rPr>
         <w:t>—No puedes ganar usando los ecos de los muertos —sentenció el Ejecutor, caminando despacio entre el polvo—. Sus memorias son débiles, fragmentadas. La luz de la Emperatriz es eterna porque se nutre de la voluntad de millones.</w:t>
         <w:br/>
         <w:br/>
@@ -676,24 +1210,72 @@
       </w:r>
     </w:p>
     <w:p>
+      <w:pPr>
+        <w:spacing w:before="120" w:after="280"/>
+        <w:jc w:val="center"/>
+      </w:pPr>
       <w:r>
-        <w:bookmarkStart w:id="16" w:name="Scene_16"/>
+        <w:drawing>
+          <wp:inline xmlns:a="http://schemas.openxmlformats.org/drawingml/2006/main" xmlns:pic="http://schemas.openxmlformats.org/drawingml/2006/picture">
+            <wp:extent cx="4754880" cy="2674620"/>
+            <wp:docPr id="12" name="Picture 12"/>
+            <wp:cNvGraphicFramePr>
+              <a:graphicFrameLocks noChangeAspect="1"/>
+            </wp:cNvGraphicFramePr>
+            <a:graphic>
+              <a:graphicData uri="http://schemas.openxmlformats.org/drawingml/2006/picture">
+                <pic:pic>
+                  <pic:nvPicPr>
+                    <pic:cNvPr id="0" name="escena_c4_e2.jpg"/>
+                    <pic:cNvPicPr/>
+                  </pic:nvPicPr>
+                  <pic:blipFill>
+                    <a:blip r:embed="rId20"/>
+                    <a:stretch>
+                      <a:fillRect/>
+                    </a:stretch>
+                  </pic:blipFill>
+                  <pic:spPr>
+                    <a:xfrm>
+                      <a:off x="0" y="0"/>
+                      <a:ext cx="4754880" cy="2674620"/>
+                    </a:xfrm>
+                    <a:prstGeom prst="rect"/>
+                  </pic:spPr>
+                </pic:pic>
+              </a:graphicData>
+            </a:graphic>
+          </wp:inline>
+        </w:drawing>
       </w:r>
+    </w:p>
+    <w:p>
+      <w:bookmarkStart w:id="41" w:name="cap_4_esc"/>
+      <w:pPr>
+        <w:keepNext/>
+        <w:spacing w:before="240" w:after="120"/>
+        <w:jc w:val="left"/>
+      </w:pPr>
       <w:r>
         <w:rPr>
-          <w:rFonts w:ascii="Arial" w:hAnsi="Arial"/>
+          <w:rFonts w:ascii="Calibri" w:hAnsi="Calibri"/>
           <w:b/>
-          <w:color w:val="EA580C"/>
-          <w:sz w:val="28"/>
+          <w:color w:val="2B6CB0"/>
+          <w:sz w:val="30"/>
         </w:rPr>
         <w:t>Escena 3: El Tercer Lazo</w:t>
       </w:r>
-      <w:r>
-        <w:bookmarkEnd w:id="16"/>
-      </w:r>
+      <w:bookmarkEnd w:id="41"/>
     </w:p>
     <w:p>
+      <w:pPr>
+        <w:spacing w:line="276" w:lineRule="auto" w:after="160"/>
+      </w:pPr>
       <w:r>
+        <w:rPr>
+          <w:rFonts w:ascii="Calibri" w:hAnsi="Calibri"/>
+          <w:sz w:val="22"/>
+        </w:rPr>
         <w:t>El Ejecutor cayó sobre una rodilla, respirando con dificultad mientras la tinta negra de la daga de Kael envenenaba su armadura dorada.</w:t>
         <w:br/>
         <w:br/>
@@ -725,41 +1307,95 @@
       </w:r>
     </w:p>
     <w:p>
+      <w:pPr>
+        <w:spacing w:before="120" w:after="280"/>
+        <w:jc w:val="center"/>
+      </w:pPr>
       <w:r>
-        <w:bookmarkStart w:id="17" w:name="Chapter_17"/>
-      </w:r>
-      <w:r>
-        <w:rPr>
-          <w:rFonts w:ascii="Arial" w:hAnsi="Arial"/>
-          <w:b/>
-          <w:color w:val="A855F7"/>
-          <w:sz w:val="36"/>
-        </w:rPr>
-        <w:t>Capítulo 5: El Eclipse del Pobre (Clímax del Volumen 1)</w:t>
-      </w:r>
-      <w:r>
-        <w:bookmarkEnd w:id="17"/>
+        <w:drawing>
+          <wp:inline xmlns:a="http://schemas.openxmlformats.org/drawingml/2006/main" xmlns:pic="http://schemas.openxmlformats.org/drawingml/2006/picture">
+            <wp:extent cx="4754880" cy="2674620"/>
+            <wp:docPr id="13" name="Picture 13"/>
+            <wp:cNvGraphicFramePr>
+              <a:graphicFrameLocks noChangeAspect="1"/>
+            </wp:cNvGraphicFramePr>
+            <a:graphic>
+              <a:graphicData uri="http://schemas.openxmlformats.org/drawingml/2006/picture">
+                <pic:pic>
+                  <pic:nvPicPr>
+                    <pic:cNvPr id="0" name="escena_c4_e3.jpg"/>
+                    <pic:cNvPicPr/>
+                  </pic:nvPicPr>
+                  <pic:blipFill>
+                    <a:blip r:embed="rId21"/>
+                    <a:stretch>
+                      <a:fillRect/>
+                    </a:stretch>
+                  </pic:blipFill>
+                  <pic:spPr>
+                    <a:xfrm>
+                      <a:off x="0" y="0"/>
+                      <a:ext cx="4754880" cy="2674620"/>
+                    </a:xfrm>
+                    <a:prstGeom prst="rect"/>
+                  </pic:spPr>
+                </pic:pic>
+              </a:graphicData>
+            </a:graphic>
+          </wp:inline>
+        </w:drawing>
       </w:r>
     </w:p>
     <w:p>
       <w:r>
-        <w:bookmarkStart w:id="18" w:name="Scene_18"/>
+        <w:br w:type="page"/>
       </w:r>
+    </w:p>
+    <w:p>
+      <w:bookmarkStart w:id="50" w:name="cap_5"/>
+      <w:pPr>
+        <w:keepNext/>
+        <w:spacing w:before="240" w:after="120"/>
+        <w:jc w:val="center"/>
+      </w:pPr>
       <w:r>
         <w:rPr>
-          <w:rFonts w:ascii="Arial" w:hAnsi="Arial"/>
+          <w:rFonts w:ascii="Calibri" w:hAnsi="Calibri"/>
           <w:b/>
-          <w:color w:val="EA580C"/>
-          <w:sz w:val="28"/>
+          <w:color w:val="1A365D"/>
+          <w:sz w:val="40"/>
+        </w:rPr>
+        <w:t>Capítulo 5: El Eclipse del Pobre (Clímax del Volumen 1)</w:t>
+      </w:r>
+      <w:bookmarkEnd w:id="50"/>
+    </w:p>
+    <w:p>
+      <w:bookmarkStart w:id="51" w:name="cap_5_esc"/>
+      <w:pPr>
+        <w:keepNext/>
+        <w:spacing w:before="240" w:after="120"/>
+        <w:jc w:val="left"/>
+      </w:pPr>
+      <w:r>
+        <w:rPr>
+          <w:rFonts w:ascii="Calibri" w:hAnsi="Calibri"/>
+          <w:b/>
+          <w:color w:val="2B6CB0"/>
+          <w:sz w:val="30"/>
         </w:rPr>
         <w:t>Escena 1: El Ascenso a la Ciudad Flotante</w:t>
       </w:r>
-      <w:r>
-        <w:bookmarkEnd w:id="18"/>
-      </w:r>
+      <w:bookmarkEnd w:id="51"/>
     </w:p>
     <w:p>
+      <w:pPr>
+        <w:spacing w:line="276" w:lineRule="auto" w:after="160"/>
+      </w:pPr>
       <w:r>
+        <w:rPr>
+          <w:rFonts w:ascii="Calibri" w:hAnsi="Calibri"/>
+          <w:sz w:val="22"/>
+        </w:rPr>
         <w:t>El residuo de luz rúnica vibraba en el centro del mercado abandonado, emitiendo un zumbido agudo que hacía temblar los cristales de las pocas linternas intactas.</w:t>
         <w:br/>
         <w:br/>
@@ -775,31 +1411,79 @@
         <w:t>Los dos hermanos dieron el paso al frente al mismo tiempo.</w:t>
         <w:br/>
         <w:br/>
-        <w:t>La luz dorada los envolvió al instante, descomponiendo sus siluetas en destellos de energía. Durante tres segundos de vértigo puro, la Ciudad de los Huecos, las catacumbas y el hedor a humedad disappeared. En su lugar, el paisaje se abrió de golpe ante la luz enceguecedora del sol real.</w:t>
+        <w:t>La luz dorada los envolvió al instante, descomponiendo sus siluetas en destellos de energía. Durante tres segundos de vértigo puro, la Ciudad de los Huecos, las catacumbas y el hedor a humedad desaparecieron. En su lugar, el paisaje se abrió de golpe ante la luz enceguecedora del sol real.</w:t>
         <w:br/>
         <w:br/>
         <w:t>Aparecieron en la plaza central de la Ciudad Flotante de Aetheria: una metrópolis suspendida sobre las nubes, construida con mármol blanco, agujas de cristal y jardines flotantes. Pero bajo la aparente belleza celestial, Kael pudo ver las enormes tuberías de succión de memoria que se clavaban en el abismo, extrayendo el fluido oscuro de los habitantes del suelo.</w:t>
       </w:r>
     </w:p>
     <w:p>
+      <w:pPr>
+        <w:spacing w:before="120" w:after="280"/>
+        <w:jc w:val="center"/>
+      </w:pPr>
       <w:r>
-        <w:bookmarkStart w:id="19" w:name="Scene_19"/>
+        <w:drawing>
+          <wp:inline xmlns:a="http://schemas.openxmlformats.org/drawingml/2006/main" xmlns:pic="http://schemas.openxmlformats.org/drawingml/2006/picture">
+            <wp:extent cx="4754880" cy="2674620"/>
+            <wp:docPr id="14" name="Picture 14"/>
+            <wp:cNvGraphicFramePr>
+              <a:graphicFrameLocks noChangeAspect="1"/>
+            </wp:cNvGraphicFramePr>
+            <a:graphic>
+              <a:graphicData uri="http://schemas.openxmlformats.org/drawingml/2006/picture">
+                <pic:pic>
+                  <pic:nvPicPr>
+                    <pic:cNvPr id="0" name="escena_c5_e1.jpg"/>
+                    <pic:cNvPicPr/>
+                  </pic:nvPicPr>
+                  <pic:blipFill>
+                    <a:blip r:embed="rId22"/>
+                    <a:stretch>
+                      <a:fillRect/>
+                    </a:stretch>
+                  </pic:blipFill>
+                  <pic:spPr>
+                    <a:xfrm>
+                      <a:off x="0" y="0"/>
+                      <a:ext cx="4754880" cy="2674620"/>
+                    </a:xfrm>
+                    <a:prstGeom prst="rect"/>
+                  </pic:spPr>
+                </pic:pic>
+              </a:graphicData>
+            </a:graphic>
+          </wp:inline>
+        </w:drawing>
       </w:r>
+    </w:p>
+    <w:p>
+      <w:bookmarkStart w:id="51" w:name="cap_5_esc"/>
+      <w:pPr>
+        <w:keepNext/>
+        <w:spacing w:before="240" w:after="120"/>
+        <w:jc w:val="left"/>
+      </w:pPr>
       <w:r>
         <w:rPr>
-          <w:rFonts w:ascii="Arial" w:hAnsi="Arial"/>
+          <w:rFonts w:ascii="Calibri" w:hAnsi="Calibri"/>
           <w:b/>
-          <w:color w:val="EA580C"/>
-          <w:sz w:val="28"/>
+          <w:color w:val="2B6CB0"/>
+          <w:sz w:val="30"/>
         </w:rPr>
         <w:t>Escena 2: El Salón de la Emperatriz</w:t>
       </w:r>
-      <w:r>
-        <w:bookmarkEnd w:id="19"/>
-      </w:r>
+      <w:bookmarkEnd w:id="51"/>
     </w:p>
     <w:p>
+      <w:pPr>
+        <w:spacing w:line="276" w:lineRule="auto" w:after="160"/>
+      </w:pPr>
       <w:r>
+        <w:rPr>
+          <w:rFonts w:ascii="Calibri" w:hAnsi="Calibri"/>
+          <w:sz w:val="22"/>
+        </w:rPr>
         <w:t>Decenas de soldados blindados con armaduras doradas rodeaban la plaza, pero ninguno se atrevió a dar un paso al frente. En el extremo superior de la gran escalinata de mármol, sentado sobre un trono suspendido que flotaba entre dos anillos rúnicos, se encontraba la figura que Kael había visto en el medallón.</w:t>
         <w:br/>
         <w:br/>
@@ -822,24 +1506,72 @@
       </w:r>
     </w:p>
     <w:p>
+      <w:pPr>
+        <w:spacing w:before="120" w:after="280"/>
+        <w:jc w:val="center"/>
+      </w:pPr>
       <w:r>
-        <w:bookmarkStart w:id="20" w:name="Scene_20"/>
+        <w:drawing>
+          <wp:inline xmlns:a="http://schemas.openxmlformats.org/drawingml/2006/main" xmlns:pic="http://schemas.openxmlformats.org/drawingml/2006/picture">
+            <wp:extent cx="4754880" cy="2674620"/>
+            <wp:docPr id="15" name="Picture 15"/>
+            <wp:cNvGraphicFramePr>
+              <a:graphicFrameLocks noChangeAspect="1"/>
+            </wp:cNvGraphicFramePr>
+            <a:graphic>
+              <a:graphicData uri="http://schemas.openxmlformats.org/drawingml/2006/picture">
+                <pic:pic>
+                  <pic:nvPicPr>
+                    <pic:cNvPr id="0" name="escena_c5_e2.jpg"/>
+                    <pic:cNvPicPr/>
+                  </pic:nvPicPr>
+                  <pic:blipFill>
+                    <a:blip r:embed="rId23"/>
+                    <a:stretch>
+                      <a:fillRect/>
+                    </a:stretch>
+                  </pic:blipFill>
+                  <pic:spPr>
+                    <a:xfrm>
+                      <a:off x="0" y="0"/>
+                      <a:ext cx="4754880" cy="2674620"/>
+                    </a:xfrm>
+                    <a:prstGeom prst="rect"/>
+                  </pic:spPr>
+                </pic:pic>
+              </a:graphicData>
+            </a:graphic>
+          </wp:inline>
+        </w:drawing>
       </w:r>
+    </w:p>
+    <w:p>
+      <w:bookmarkStart w:id="51" w:name="cap_5_esc"/>
+      <w:pPr>
+        <w:keepNext/>
+        <w:spacing w:before="240" w:after="120"/>
+        <w:jc w:val="left"/>
+      </w:pPr>
       <w:r>
         <w:rPr>
-          <w:rFonts w:ascii="Arial" w:hAnsi="Arial"/>
+          <w:rFonts w:ascii="Calibri" w:hAnsi="Calibri"/>
           <w:b/>
-          <w:color w:val="EA580C"/>
-          <w:sz w:val="28"/>
+          <w:color w:val="2B6CB0"/>
+          <w:sz w:val="30"/>
         </w:rPr>
         <w:t>Escena 3: El Eclipse de Tinta (Cierre del Tomo 1)</w:t>
       </w:r>
-      <w:r>
-        <w:bookmarkEnd w:id="20"/>
-      </w:r>
+      <w:bookmarkEnd w:id="51"/>
     </w:p>
     <w:p>
+      <w:pPr>
+        <w:spacing w:line="276" w:lineRule="auto" w:after="160"/>
+      </w:pPr>
       <w:r>
+        <w:rPr>
+          <w:rFonts w:ascii="Calibri" w:hAnsi="Calibri"/>
+          <w:sz w:val="22"/>
+        </w:rPr>
         <w:t>Las palabras de la Emperatriz resonaban en la mente de Kael como un eco interminable. Por un segundo, la tentación de caer en la desesperación amenazó con apagar la luz de su ojo rúnico. Pero al mirar sus antebrazos —cubiertos de cicatrices y marcas de fuego negro— y recordar la mirada del soldado Marcus y la gente condenada en el Sector Cero, Kael apretó los dientes.</w:t>
         <w:br/>
         <w:br/>
@@ -863,15 +1595,14 @@
     </w:p>
     <w:p>
       <w:pPr>
+        <w:spacing w:before="120" w:after="280"/>
         <w:jc w:val="center"/>
       </w:pPr>
-    </w:p>
-    <w:p>
       <w:r>
         <w:drawing>
           <wp:inline xmlns:a="http://schemas.openxmlformats.org/drawingml/2006/main" xmlns:pic="http://schemas.openxmlformats.org/drawingml/2006/picture">
-            <wp:extent cx="5029200" cy="2806995"/>
-            <wp:docPr id="2" name="Picture 2"/>
+            <wp:extent cx="4754880" cy="2674620"/>
+            <wp:docPr id="16" name="Picture 16"/>
             <wp:cNvGraphicFramePr>
               <a:graphicFrameLocks noChangeAspect="1"/>
             </wp:cNvGraphicFramePr>
@@ -879,11 +1610,11 @@
               <a:graphicData uri="http://schemas.openxmlformats.org/drawingml/2006/picture">
                 <pic:pic>
                   <pic:nvPicPr>
-                    <pic:cNvPr id="0" name="escena_climax.jpg"/>
+                    <pic:cNvPr id="0" name="escena_c5_e3.jpg"/>
                     <pic:cNvPicPr/>
                   </pic:nvPicPr>
                   <pic:blipFill>
-                    <a:blip r:embed="rId10"/>
+                    <a:blip r:embed="rId24"/>
                     <a:stretch>
                       <a:fillRect/>
                     </a:stretch>
@@ -891,7 +1622,7 @@
                   <pic:spPr>
                     <a:xfrm>
                       <a:off x="0" y="0"/>
-                      <a:ext cx="5029200" cy="2806995"/>
+                      <a:ext cx="4754880" cy="2674620"/>
                     </a:xfrm>
                     <a:prstGeom prst="rect"/>
                   </pic:spPr>
@@ -900,6 +1631,11 @@
             </a:graphic>
           </wp:inline>
         </w:drawing>
+      </w:r>
+    </w:p>
+    <w:p>
+      <w:r>
+        <w:br w:type="page"/>
       </w:r>
     </w:p>
     <w:sectPr>
@@ -1275,9 +2011,6 @@
     <w:name w:val="Normal"/>
     <w:qFormat/>
     <w:rsid w:val="00FC693F"/>
-    <w:rPr>
-      <w:sz w:val="22"/>
-    </w:rPr>
   </w:style>
   <w:style w:type="paragraph" w:styleId="Header">
     <w:name w:val="header"/>

</xml_diff>